<commit_message>
Add quotation conditions to templates and support multiline text
</commit_message>
<xml_diff>
--- a/templates/ifs_quotation.docx
+++ b/templates/ifs_quotation.docx
@@ -926,7 +926,103 @@
               <w:rPr>
                 <w:rStyle w:val="fLabel"/>
               </w:rPr>
-              <w:t xml:space="preserve">SYARAT DAN KETENTUAN</w:t>
+              <w:t xml:space="preserve">KETENTUAN PENAWARAN</w:t>
+            </w:r>
+          </w:p>
+          <w:p>
+            <w:pPr>
+              <w:spacing w:after="20"/>
+            </w:pPr>
+            <w:r>
+              <w:rPr>
+                <w:rStyle w:val="fSmallBold"/>
+              </w:rPr>
+              <w:t xml:space="preserve">Kondisi Stok: </w:t>
+            </w:r>
+            <w:r>
+              <w:rPr>
+                <w:rStyle w:val="fSmall"/>
+              </w:rPr>
+              <w:t xml:space="preserve">${stock_conditions}</w:t>
+            </w:r>
+          </w:p>
+          <w:p>
+            <w:pPr>
+              <w:spacing w:after="20"/>
+            </w:pPr>
+            <w:r>
+              <w:rPr>
+                <w:rStyle w:val="fSmallBold"/>
+              </w:rPr>
+              <w:t xml:space="preserve">Syarat Pembayaran: </w:t>
+            </w:r>
+            <w:r>
+              <w:rPr>
+                <w:rStyle w:val="fSmall"/>
+              </w:rPr>
+              <w:t xml:space="preserve">${term_of_payment}</w:t>
+            </w:r>
+          </w:p>
+          <w:p>
+            <w:pPr>
+              <w:spacing w:after="20"/>
+            </w:pPr>
+            <w:r>
+              <w:rPr>
+                <w:rStyle w:val="fSmallBold"/>
+              </w:rPr>
+              <w:t xml:space="preserve">Kondisi Harga: </w:t>
+            </w:r>
+            <w:r>
+              <w:rPr>
+                <w:rStyle w:val="fSmall"/>
+              </w:rPr>
+              <w:t xml:space="preserve">${price_conditions}</w:t>
+            </w:r>
+          </w:p>
+          <w:p>
+            <w:pPr>
+              <w:spacing w:after="20"/>
+            </w:pPr>
+            <w:r>
+              <w:rPr>
+                <w:rStyle w:val="fSmallBold"/>
+              </w:rPr>
+              <w:t xml:space="preserve">Standard Packing: </w:t>
+            </w:r>
+            <w:r>
+              <w:rPr>
+                <w:rStyle w:val="fSmall"/>
+              </w:rPr>
+              <w:t xml:space="preserve">${standard_packing}</w:t>
+            </w:r>
+          </w:p>
+          <w:p>
+            <w:pPr>
+              <w:spacing w:after="40"/>
+            </w:pPr>
+            <w:r>
+              <w:rPr>
+                <w:rStyle w:val="fSmallBold"/>
+              </w:rPr>
+              <w:t xml:space="preserve">Masa Berlaku: </w:t>
+            </w:r>
+            <w:r>
+              <w:rPr>
+                <w:rStyle w:val="fSmall"/>
+              </w:rPr>
+              <w:t xml:space="preserve">${offer_validity}</w:t>
+            </w:r>
+          </w:p>
+          <w:p>
+            <w:pPr>
+              <w:pStyle w:val="pLeft"/>
+            </w:pPr>
+            <w:r>
+              <w:rPr>
+                <w:rStyle w:val="fLabel"/>
+              </w:rPr>
+              <w:t xml:space="preserve">Catatan / Syarat Lain:</w:t>
             </w:r>
           </w:p>
           <w:p>
@@ -938,28 +1034,6 @@
                 <w:rStyle w:val="fSmall"/>
               </w:rPr>
               <w:t xml:space="preserve">${terms}</w:t>
-            </w:r>
-          </w:p>
-          <w:p>
-            <w:pPr>
-              <w:pStyle w:val="pAddress"/>
-            </w:pPr>
-            <w:r>
-              <w:rPr>
-                <w:rStyle w:val="fValue"/>
-              </w:rPr>
-              <w:t xml:space="preserve"> </w:t>
-            </w:r>
-          </w:p>
-          <w:p>
-            <w:pPr>
-              <w:pStyle w:val="pLeft"/>
-            </w:pPr>
-            <w:r>
-              <w:rPr>
-                <w:rStyle w:val="fLabel"/>
-              </w:rPr>
-              <w:t xml:space="preserve">Catatan:</w:t>
             </w:r>
           </w:p>
           <w:p>

</xml_diff>

<commit_message>
Implement Indonesian validation translations, uppercase DP/Pelunasan abbreviations, partner document history page, and global custom modal alerts/confirmations
</commit_message>
<xml_diff>
--- a/templates/ifs_quotation.docx
+++ b/templates/ifs_quotation.docx
@@ -621,18 +621,17 @@
     </w:tbl>
     <w:tbl>
       <w:tblGrid>
-        <w:gridCol w:w="1984.251968503937" w:type="dxa"/>
-        <w:gridCol w:w="1984.251968503937" w:type="dxa"/>
+        <w:gridCol w:w="5385.826771653543" w:type="dxa"/>
+        <w:gridCol w:w="4535.433070866141" w:type="dxa"/>
       </w:tblGrid>
       <w:tblPr>
-        <w:jc w:val="end"/>
         <w:tblW w:w="0" w:type="auto"/>
         <w:tblLayout w:type="autofit"/>
         <w:tblCellMar>
-          <w:top w:w="40" w:type="dxa"/>
-          <w:left w:w="40" w:type="dxa"/>
-          <w:right w:w="40" w:type="dxa"/>
-          <w:bottom w:w="40" w:type="dxa"/>
+          <w:top w:w="0" w:type="dxa"/>
+          <w:left w:w="0" w:type="dxa"/>
+          <w:right w:w="0" w:type="dxa"/>
+          <w:bottom w:w="0" w:type="dxa"/>
         </w:tblCellMar>
         <w:tblBorders>
           <w:top w:val="single" w:sz="0"/>
@@ -647,158 +646,359 @@
         <w:trPr/>
         <w:tc>
           <w:tcPr>
-            <w:tcW w:w="1984.251968503937" w:type="dxa"/>
-            <w:noWrap/>
-          </w:tcPr>
-          <w:p>
-            <w:pPr>
-              <w:pStyle w:val="pRight"/>
+            <w:tcW w:w="5385.826771653543" w:type="dxa"/>
+            <w:vAlign w:val="top"/>
+            <w:noWrap/>
+          </w:tcPr>
+          <w:p>
+            <w:pPr>
+              <w:pStyle w:val="pLeft"/>
             </w:pPr>
             <w:r>
               <w:rPr>
                 <w:rStyle w:val="fLabel"/>
               </w:rPr>
-              <w:t xml:space="preserve">Subtotal</w:t>
-            </w:r>
-          </w:p>
-        </w:tc>
-        <w:tc>
-          <w:tcPr>
-            <w:tcW w:w="1984.251968503937" w:type="dxa"/>
-            <w:shd w:val="clear"/>
-            <w:noWrap/>
-          </w:tcPr>
-          <w:p>
-            <w:pPr>
-              <w:pStyle w:val="pRight"/>
-            </w:pPr>
-            <w:r>
-              <w:rPr>
-                <w:rStyle w:val="fValue"/>
-              </w:rPr>
-              <w:t xml:space="preserve">${subtotal}</w:t>
-            </w:r>
-          </w:p>
-        </w:tc>
-      </w:tr>
-      <w:tr>
-        <w:trPr/>
-        <w:tc>
-          <w:tcPr>
-            <w:tcW w:w="1984.251968503937" w:type="dxa"/>
-            <w:noWrap/>
-          </w:tcPr>
-          <w:p>
-            <w:pPr>
-              <w:pStyle w:val="pRight"/>
-            </w:pPr>
-            <w:r>
-              <w:rPr>
-                <w:rStyle w:val="fLabel"/>
-              </w:rPr>
-              <w:t xml:space="preserve">Diskon</w:t>
-            </w:r>
-          </w:p>
-        </w:tc>
-        <w:tc>
-          <w:tcPr>
-            <w:tcW w:w="1984.251968503937" w:type="dxa"/>
-            <w:shd w:val="clear"/>
-            <w:noWrap/>
-          </w:tcPr>
-          <w:p>
-            <w:pPr>
-              <w:pStyle w:val="pRight"/>
-            </w:pPr>
-            <w:r>
-              <w:rPr>
-                <w:rStyle w:val="fValue"/>
-              </w:rPr>
-              <w:t xml:space="preserve">${discount}</w:t>
-            </w:r>
-          </w:p>
-        </w:tc>
-      </w:tr>
-      <w:tr>
-        <w:trPr/>
-        <w:tc>
-          <w:tcPr>
-            <w:tcW w:w="1984.251968503937" w:type="dxa"/>
-            <w:noWrap/>
-          </w:tcPr>
-          <w:p>
-            <w:pPr>
-              <w:pStyle w:val="pRight"/>
-            </w:pPr>
-            <w:r>
-              <w:rPr>
-                <w:rStyle w:val="fLabel"/>
-              </w:rPr>
-              <w:t xml:space="preserve">PPN (11%)</w:t>
-            </w:r>
-          </w:p>
-        </w:tc>
-        <w:tc>
-          <w:tcPr>
-            <w:tcW w:w="1984.251968503937" w:type="dxa"/>
-            <w:shd w:val="clear"/>
-            <w:noWrap/>
-          </w:tcPr>
-          <w:p>
-            <w:pPr>
-              <w:pStyle w:val="pRight"/>
-            </w:pPr>
-            <w:r>
-              <w:rPr>
-                <w:rStyle w:val="fValue"/>
-              </w:rPr>
-              <w:t xml:space="preserve">${tax}</w:t>
-            </w:r>
-          </w:p>
-        </w:tc>
-      </w:tr>
-      <w:tr>
-        <w:trPr/>
-        <w:tc>
-          <w:tcPr>
-            <w:tcW w:w="1984.251968503937" w:type="dxa"/>
-            <w:noWrap/>
-          </w:tcPr>
-          <w:p>
-            <w:pPr>
-              <w:pStyle w:val="pRight"/>
-            </w:pPr>
-            <w:r>
-              <w:rPr>
-                <w:rStyle w:val="fTotalLabel"/>
-              </w:rPr>
-              <w:t xml:space="preserve">Total</w:t>
-            </w:r>
-          </w:p>
-        </w:tc>
-        <w:tc>
-          <w:tcPr>
-            <w:tcW w:w="1984.251968503937" w:type="dxa"/>
-            <w:tcBorders>
-              <w:top w:val="single" w:sz="1" w:color="1A56DB"/>
-              <w:left w:val="single" w:sz="1" w:color="1A56DB"/>
-              <w:right w:val="single" w:sz="1" w:color="1A56DB"/>
-              <w:bottom w:val="single" w:sz="1" w:color="1A56DB"/>
-            </w:tcBorders>
-            <w:shd w:val="clear" w:fill="E8EFFD"/>
-            <w:noWrap/>
-          </w:tcPr>
-          <w:p>
-            <w:pPr>
-              <w:pStyle w:val="pRight"/>
-            </w:pPr>
-            <w:r>
-              <w:rPr>
-                <w:rStyle w:val="fTotalValue"/>
-              </w:rPr>
-              <w:t xml:space="preserve">${grand_total}</w:t>
-            </w:r>
-          </w:p>
+              <w:t xml:space="preserve">INFORMASI PEMBAYARAN</w:t>
+            </w:r>
+          </w:p>
+          <w:p>
+            <w:pPr>
+              <w:pStyle w:val="pAddress"/>
+            </w:pPr>
+            <w:r>
+              <w:rPr>
+                <w:rStyle w:val="fValue"/>
+              </w:rPr>
+              <w:t xml:space="preserve">Bank: ${bank_name}</w:t>
+            </w:r>
+          </w:p>
+          <w:p>
+            <w:pPr>
+              <w:pStyle w:val="pAddress"/>
+            </w:pPr>
+            <w:r>
+              <w:rPr>
+                <w:rStyle w:val="fValue"/>
+              </w:rPr>
+              <w:t xml:space="preserve">No. Rekening: ${bank_account_number}</w:t>
+            </w:r>
+          </w:p>
+          <w:p>
+            <w:pPr>
+              <w:pStyle w:val="pAddress"/>
+            </w:pPr>
+            <w:r>
+              <w:rPr>
+                <w:rStyle w:val="fValue"/>
+              </w:rPr>
+              <w:t xml:space="preserve">Atas Nama: ${bank_account_name}</w:t>
+            </w:r>
+          </w:p>
+        </w:tc>
+        <w:tc>
+          <w:tcPr>
+            <w:tcW w:w="4535.433070866141" w:type="dxa"/>
+            <w:vAlign w:val="top"/>
+            <w:noWrap/>
+          </w:tcPr>
+          <w:tbl>
+            <w:tblGrid>
+              <w:gridCol w:w="2551.1811023622045" w:type="dxa"/>
+              <w:gridCol w:w="1984.251968503937" w:type="dxa"/>
+            </w:tblGrid>
+            <w:tblPr>
+              <w:jc w:val="end"/>
+              <w:tblW w:w="0" w:type="auto"/>
+              <w:tblLayout w:type="autofit"/>
+              <w:tblCellMar>
+                <w:top w:w="40" w:type="dxa"/>
+                <w:left w:w="40" w:type="dxa"/>
+                <w:right w:w="40" w:type="dxa"/>
+                <w:bottom w:w="40" w:type="dxa"/>
+              </w:tblCellMar>
+              <w:tblBorders>
+                <w:top w:val="single" w:sz="0"/>
+                <w:left w:val="single" w:sz="0"/>
+                <w:right w:val="single" w:sz="0"/>
+                <w:bottom w:val="single" w:sz="0"/>
+                <w:insideH w:val="single" w:sz="0"/>
+                <w:insideV w:val="single" w:sz="0"/>
+              </w:tblBorders>
+            </w:tblPr>
+            <w:tr>
+              <w:trPr/>
+              <w:tc>
+                <w:tcPr>
+                  <w:tcW w:w="2551.1811023622045" w:type="dxa"/>
+                  <w:noWrap/>
+                </w:tcPr>
+                <w:p>
+                  <w:pPr>
+                    <w:pStyle w:val="pRight"/>
+                  </w:pPr>
+                  <w:r>
+                    <w:rPr>
+                      <w:rStyle w:val="fLabel"/>
+                    </w:rPr>
+                    <w:t xml:space="preserve">Subtotal</w:t>
+                  </w:r>
+                </w:p>
+              </w:tc>
+              <w:tc>
+                <w:tcPr>
+                  <w:tcW w:w="1984.251968503937" w:type="dxa"/>
+                  <w:shd w:val="clear"/>
+                  <w:noWrap/>
+                </w:tcPr>
+                <w:p>
+                  <w:pPr>
+                    <w:pStyle w:val="pRight"/>
+                  </w:pPr>
+                  <w:r>
+                    <w:rPr>
+                      <w:rStyle w:val="fValue"/>
+                    </w:rPr>
+                    <w:t xml:space="preserve">${subtotal}</w:t>
+                  </w:r>
+                </w:p>
+              </w:tc>
+            </w:tr>
+            <w:tr>
+              <w:trPr/>
+              <w:tc>
+                <w:tcPr>
+                  <w:tcW w:w="2551.1811023622045" w:type="dxa"/>
+                  <w:noWrap/>
+                </w:tcPr>
+                <w:p>
+                  <w:pPr>
+                    <w:pStyle w:val="pRight"/>
+                  </w:pPr>
+                  <w:r>
+                    <w:rPr>
+                      <w:rStyle w:val="fLabel"/>
+                    </w:rPr>
+                    <w:t xml:space="preserve">Diskon</w:t>
+                  </w:r>
+                </w:p>
+              </w:tc>
+              <w:tc>
+                <w:tcPr>
+                  <w:tcW w:w="1984.251968503937" w:type="dxa"/>
+                  <w:shd w:val="clear"/>
+                  <w:noWrap/>
+                </w:tcPr>
+                <w:p>
+                  <w:pPr>
+                    <w:pStyle w:val="pRight"/>
+                  </w:pPr>
+                  <w:r>
+                    <w:rPr>
+                      <w:rStyle w:val="fValue"/>
+                    </w:rPr>
+                    <w:t xml:space="preserve">${discount}</w:t>
+                  </w:r>
+                </w:p>
+              </w:tc>
+            </w:tr>
+            <w:tr>
+              <w:trPr/>
+              <w:tc>
+                <w:tcPr>
+                  <w:tcW w:w="2551.1811023622045" w:type="dxa"/>
+                  <w:noWrap/>
+                </w:tcPr>
+                <w:p>
+                  <w:pPr>
+                    <w:pStyle w:val="pRight"/>
+                  </w:pPr>
+                  <w:r>
+                    <w:rPr>
+                      <w:rStyle w:val="fLabel"/>
+                    </w:rPr>
+                    <w:t xml:space="preserve">PPN (11%)</w:t>
+                  </w:r>
+                </w:p>
+              </w:tc>
+              <w:tc>
+                <w:tcPr>
+                  <w:tcW w:w="1984.251968503937" w:type="dxa"/>
+                  <w:shd w:val="clear"/>
+                  <w:noWrap/>
+                </w:tcPr>
+                <w:p>
+                  <w:pPr>
+                    <w:pStyle w:val="pRight"/>
+                  </w:pPr>
+                  <w:r>
+                    <w:rPr>
+                      <w:rStyle w:val="fValue"/>
+                    </w:rPr>
+                    <w:t xml:space="preserve">${tax}</w:t>
+                  </w:r>
+                </w:p>
+              </w:tc>
+            </w:tr>
+            <w:tr>
+              <w:trPr/>
+              <w:tc>
+                <w:tcPr>
+                  <w:tcW w:w="2551.1811023622045" w:type="dxa"/>
+                  <w:noWrap/>
+                </w:tcPr>
+                <w:p>
+                  <w:pPr>
+                    <w:pStyle w:val="pRight"/>
+                  </w:pPr>
+                  <w:r>
+                    <w:rPr>
+                      <w:rStyle w:val="fLabel"/>
+                    </w:rPr>
+                    <w:t xml:space="preserve">Total Tagihan</w:t>
+                  </w:r>
+                </w:p>
+              </w:tc>
+              <w:tc>
+                <w:tcPr>
+                  <w:tcW w:w="1984.251968503937" w:type="dxa"/>
+                  <w:shd w:val="clear"/>
+                  <w:noWrap/>
+                </w:tcPr>
+                <w:p>
+                  <w:pPr>
+                    <w:pStyle w:val="pRight"/>
+                  </w:pPr>
+                  <w:r>
+                    <w:rPr>
+                      <w:rStyle w:val="fValue"/>
+                    </w:rPr>
+                    <w:t xml:space="preserve">${total_tagihan}</w:t>
+                  </w:r>
+                </w:p>
+              </w:tc>
+            </w:tr>
+            <w:tr>
+              <w:trPr/>
+              <w:tc>
+                <w:tcPr>
+                  <w:tcW w:w="2551.1811023622045" w:type="dxa"/>
+                  <w:noWrap/>
+                </w:tcPr>
+                <w:p>
+                  <w:pPr>
+                    <w:pStyle w:val="pRight"/>
+                  </w:pPr>
+                  <w:r>
+                    <w:rPr>
+                      <w:rStyle w:val="fLabel"/>
+                    </w:rPr>
+                    <w:t xml:space="preserve">${dp_label}</w:t>
+                  </w:r>
+                </w:p>
+              </w:tc>
+              <w:tc>
+                <w:tcPr>
+                  <w:tcW w:w="1984.251968503937" w:type="dxa"/>
+                  <w:shd w:val="clear"/>
+                  <w:noWrap/>
+                </w:tcPr>
+                <w:p>
+                  <w:pPr>
+                    <w:pStyle w:val="pRight"/>
+                  </w:pPr>
+                  <w:r>
+                    <w:rPr>
+                      <w:rStyle w:val="fValue"/>
+                    </w:rPr>
+                    <w:t xml:space="preserve">${dp_value}</w:t>
+                  </w:r>
+                </w:p>
+              </w:tc>
+            </w:tr>
+            <w:tr>
+              <w:trPr/>
+              <w:tc>
+                <w:tcPr>
+                  <w:tcW w:w="2551.1811023622045" w:type="dxa"/>
+                  <w:noWrap/>
+                </w:tcPr>
+                <w:p>
+                  <w:pPr>
+                    <w:pStyle w:val="pRight"/>
+                  </w:pPr>
+                  <w:r>
+                    <w:rPr>
+                      <w:rStyle w:val="fLabel"/>
+                    </w:rPr>
+                    <w:t xml:space="preserve">${rem_label}</w:t>
+                  </w:r>
+                </w:p>
+              </w:tc>
+              <w:tc>
+                <w:tcPr>
+                  <w:tcW w:w="1984.251968503937" w:type="dxa"/>
+                  <w:shd w:val="clear"/>
+                  <w:noWrap/>
+                </w:tcPr>
+                <w:p>
+                  <w:pPr>
+                    <w:pStyle w:val="pRight"/>
+                  </w:pPr>
+                  <w:r>
+                    <w:rPr>
+                      <w:rStyle w:val="fValue"/>
+                    </w:rPr>
+                    <w:t xml:space="preserve">${rem_value}</w:t>
+                  </w:r>
+                </w:p>
+              </w:tc>
+            </w:tr>
+            <w:tr>
+              <w:trPr/>
+              <w:tc>
+                <w:tcPr>
+                  <w:tcW w:w="2551.1811023622045" w:type="dxa"/>
+                  <w:noWrap/>
+                </w:tcPr>
+                <w:p>
+                  <w:pPr>
+                    <w:pStyle w:val="pRight"/>
+                  </w:pPr>
+                  <w:r>
+                    <w:rPr>
+                      <w:rStyle w:val="fTotalLabel"/>
+                    </w:rPr>
+                    <w:t xml:space="preserve">${payment_type_label}</w:t>
+                  </w:r>
+                </w:p>
+              </w:tc>
+              <w:tc>
+                <w:tcPr>
+                  <w:tcW w:w="1984.251968503937" w:type="dxa"/>
+                  <w:tcBorders>
+                    <w:top w:val="single" w:sz="1" w:color="1A56DB"/>
+                    <w:left w:val="single" w:sz="1" w:color="1A56DB"/>
+                    <w:right w:val="single" w:sz="1" w:color="1A56DB"/>
+                    <w:bottom w:val="single" w:sz="1" w:color="1A56DB"/>
+                  </w:tcBorders>
+                  <w:shd w:val="clear" w:fill="E8EFFD"/>
+                  <w:noWrap/>
+                </w:tcPr>
+                <w:p>
+                  <w:pPr>
+                    <w:pStyle w:val="pRight"/>
+                  </w:pPr>
+                  <w:r>
+                    <w:rPr>
+                      <w:rStyle w:val="fTotalValue"/>
+                    </w:rPr>
+                    <w:t xml:space="preserve">${grand_total}</w:t>
+                  </w:r>
+                </w:p>
+              </w:tc>
+            </w:tr>
+          </w:tbl>
+          <w:p/>
         </w:tc>
       </w:tr>
     </w:tbl>
@@ -840,8 +1040,7 @@
     </w:p>
     <w:tbl>
       <w:tblGrid>
-        <w:gridCol w:w="5102.362204724409" w:type="dxa"/>
-        <w:gridCol w:w="4818.897637795275" w:type="dxa"/>
+        <w:gridCol w:w="9921.259842519685" w:type="dxa"/>
       </w:tblGrid>
       <w:tblPr>
         <w:tblW w:w="0" w:type="auto"/>
@@ -865,57 +1064,7 @@
         <w:trPr/>
         <w:tc>
           <w:tcPr>
-            <w:tcW w:w="5102.362204724409" w:type="dxa"/>
-            <w:noWrap/>
-          </w:tcPr>
-          <w:p>
-            <w:pPr>
-              <w:pStyle w:val="pLeft"/>
-            </w:pPr>
-            <w:r>
-              <w:rPr>
-                <w:rStyle w:val="fLabel"/>
-              </w:rPr>
-              <w:t xml:space="preserve">INFORMASI PEMBAYARAN</w:t>
-            </w:r>
-          </w:p>
-          <w:p>
-            <w:pPr>
-              <w:pStyle w:val="pAddress"/>
-            </w:pPr>
-            <w:r>
-              <w:rPr>
-                <w:rStyle w:val="fValue"/>
-              </w:rPr>
-              <w:t xml:space="preserve">Bank ${bank_name}</w:t>
-            </w:r>
-          </w:p>
-          <w:p>
-            <w:pPr>
-              <w:pStyle w:val="pAddress"/>
-            </w:pPr>
-            <w:r>
-              <w:rPr>
-                <w:rStyle w:val="fValue"/>
-              </w:rPr>
-              <w:t xml:space="preserve">Atas Nama: ${bank_account_name}</w:t>
-            </w:r>
-          </w:p>
-          <w:p>
-            <w:pPr>
-              <w:pStyle w:val="pAddress"/>
-            </w:pPr>
-            <w:r>
-              <w:rPr>
-                <w:rStyle w:val="fValue"/>
-              </w:rPr>
-              <w:t xml:space="preserve">No. Rekening: ${bank_account_number}</w:t>
-            </w:r>
-          </w:p>
-        </w:tc>
-        <w:tc>
-          <w:tcPr>
-            <w:tcW w:w="4818.897637795275" w:type="dxa"/>
+            <w:tcW w:w="9921.259842519685" w:type="dxa"/>
             <w:noWrap/>
           </w:tcPr>
           <w:p>

</xml_diff>